<commit_message>
addition of class lecture
</commit_message>
<xml_diff>
--- a/additional_material/1_git_and_github/simple commands.docx
+++ b/additional_material/1_git_and_github/simple commands.docx
@@ -366,18 +366,7 @@
           <w:sz w:val="21"/>
           <w:szCs w:val="21"/>
         </w:rPr>
-        <w:t xml:space="preserve"> needs to </w:t>
-      </w:r>
-      <w:bookmarkStart w:id="0" w:name="_GoBack"/>
-      <w:bookmarkEnd w:id="0"/>
-      <w:r>
-        <w:rPr>
-          <w:rFonts w:ascii="Consolas" w:eastAsia="Times New Roman" w:hAnsi="Consolas" w:cs="Courier New"/>
-          <w:color w:val="1F2328"/>
-          <w:sz w:val="21"/>
-          <w:szCs w:val="21"/>
-        </w:rPr>
-        <w:t>be done once per repository</w:t>
+        <w:t xml:space="preserve"> needs to be done once per repository</w:t>
       </w:r>
     </w:p>
     <w:p>
@@ -768,6 +757,8 @@
         </w:rPr>
         <w:t xml:space="preserve"> to cloud</w:t>
       </w:r>
+      <w:bookmarkStart w:id="0" w:name="_GoBack"/>
+      <w:bookmarkEnd w:id="0"/>
     </w:p>
     <w:p>
       <w:pPr>
@@ -949,6 +940,125 @@
         <w:t xml:space="preserve"> a new repository and commit code there and then make changes and commit code (3 commits)</w:t>
       </w:r>
     </w:p>
+    <w:p>
+      <w:proofErr w:type="gramStart"/>
+      <w:r>
+        <w:t>optional</w:t>
+      </w:r>
+      <w:proofErr w:type="gramEnd"/>
+      <w:r>
+        <w:t xml:space="preserve"> commands</w:t>
+      </w:r>
+    </w:p>
+    <w:p>
+      <w:r>
+        <w:t xml:space="preserve"># </w:t>
+      </w:r>
+      <w:proofErr w:type="gramStart"/>
+      <w:r>
+        <w:t>to</w:t>
+      </w:r>
+      <w:proofErr w:type="gramEnd"/>
+      <w:r>
+        <w:t xml:space="preserve"> check the logs</w:t>
+      </w:r>
+    </w:p>
+    <w:p>
+      <w:proofErr w:type="spellStart"/>
+      <w:proofErr w:type="gramStart"/>
+      <w:r>
+        <w:t>git</w:t>
+      </w:r>
+      <w:proofErr w:type="spellEnd"/>
+      <w:proofErr w:type="gramEnd"/>
+      <w:r>
+        <w:t xml:space="preserve"> log</w:t>
+      </w:r>
+      <w:r>
+        <w:t xml:space="preserve">            </w:t>
+      </w:r>
+      <w:r>
+        <w:rPr>
+          <w:b/>
+        </w:rPr>
+        <w:t>:</w:t>
+      </w:r>
+      <w:proofErr w:type="spellStart"/>
+      <w:r>
+        <w:rPr>
+          <w:b/>
+        </w:rPr>
+        <w:t>wq</w:t>
+      </w:r>
+      <w:proofErr w:type="spellEnd"/>
+    </w:p>
+    <w:p>
+      <w:r>
+        <w:t xml:space="preserve"># </w:t>
+      </w:r>
+      <w:proofErr w:type="gramStart"/>
+      <w:r>
+        <w:t>to</w:t>
+      </w:r>
+      <w:proofErr w:type="gramEnd"/>
+      <w:r>
+        <w:t xml:space="preserve"> check the status</w:t>
+      </w:r>
+    </w:p>
+    <w:p>
+      <w:proofErr w:type="spellStart"/>
+      <w:proofErr w:type="gramStart"/>
+      <w:r>
+        <w:t>git</w:t>
+      </w:r>
+      <w:proofErr w:type="spellEnd"/>
+      <w:proofErr w:type="gramEnd"/>
+      <w:r>
+        <w:t xml:space="preserve"> status</w:t>
+      </w:r>
+    </w:p>
+    <w:p>
+      <w:r>
+        <w:t xml:space="preserve"># </w:t>
+      </w:r>
+      <w:proofErr w:type="gramStart"/>
+      <w:r>
+        <w:t>rollback</w:t>
+      </w:r>
+      <w:proofErr w:type="gramEnd"/>
+    </w:p>
+    <w:p>
+      <w:proofErr w:type="spellStart"/>
+      <w:proofErr w:type="gramStart"/>
+      <w:r>
+        <w:t>git</w:t>
+      </w:r>
+      <w:proofErr w:type="spellEnd"/>
+      <w:proofErr w:type="gramEnd"/>
+      <w:r>
+        <w:t xml:space="preserve"> reset –hard </w:t>
+      </w:r>
+      <w:proofErr w:type="spellStart"/>
+      <w:r>
+        <w:t>commit_</w:t>
+      </w:r>
+      <w:r>
+        <w:t>hash</w:t>
+      </w:r>
+      <w:proofErr w:type="spellEnd"/>
+    </w:p>
+    <w:p>
+      <w:proofErr w:type="spellStart"/>
+      <w:proofErr w:type="gramStart"/>
+      <w:r>
+        <w:t>git</w:t>
+      </w:r>
+      <w:proofErr w:type="spellEnd"/>
+      <w:proofErr w:type="gramEnd"/>
+      <w:r>
+        <w:t xml:space="preserve"> push origin main --force</w:t>
+      </w:r>
+    </w:p>
     <w:p/>
     <w:p>
       <w:pPr>
@@ -1008,17 +1118,20 @@
         <w:rPr>
           <w:highlight w:val="cyan"/>
         </w:rPr>
+        <w:lastRenderedPageBreak/>
         <w:t>Main</w:t>
       </w:r>
     </w:p>
     <w:p>
       <w:pPr>
         <w:rPr>
+          <w:color w:val="FF0000"/>
           <w:highlight w:val="cyan"/>
         </w:rPr>
       </w:pPr>
       <w:r>
         <w:rPr>
+          <w:color w:val="FF0000"/>
           <w:highlight w:val="cyan"/>
         </w:rPr>
         <w:t>UAT (optional)</w:t>
@@ -1027,11 +1140,13 @@
     <w:p>
       <w:pPr>
         <w:rPr>
+          <w:color w:val="FF0000"/>
           <w:highlight w:val="cyan"/>
         </w:rPr>
       </w:pPr>
       <w:r>
         <w:rPr>
+          <w:color w:val="FF0000"/>
           <w:highlight w:val="cyan"/>
         </w:rPr>
         <w:t>QA (optional)</w:t>
@@ -1073,7 +1188,129 @@
       </w:r>
     </w:p>
     <w:p/>
-    <w:p/>
+    <w:p>
+      <w:r>
+        <w:t xml:space="preserve"># </w:t>
+      </w:r>
+      <w:proofErr w:type="gramStart"/>
+      <w:r>
+        <w:t>to</w:t>
+      </w:r>
+      <w:proofErr w:type="gramEnd"/>
+      <w:r>
+        <w:t xml:space="preserve"> check on which branch you are</w:t>
+      </w:r>
+    </w:p>
+    <w:p>
+      <w:proofErr w:type="spellStart"/>
+      <w:proofErr w:type="gramStart"/>
+      <w:r>
+        <w:t>git</w:t>
+      </w:r>
+      <w:proofErr w:type="spellEnd"/>
+      <w:proofErr w:type="gramEnd"/>
+      <w:r>
+        <w:t xml:space="preserve"> branch</w:t>
+      </w:r>
+    </w:p>
+    <w:p>
+      <w:r>
+        <w:t># make a new branch</w:t>
+      </w:r>
+    </w:p>
+    <w:p>
+      <w:proofErr w:type="spellStart"/>
+      <w:proofErr w:type="gramStart"/>
+      <w:r>
+        <w:t>git</w:t>
+      </w:r>
+      <w:proofErr w:type="spellEnd"/>
+      <w:proofErr w:type="gramEnd"/>
+      <w:r>
+        <w:t xml:space="preserve"> branch branch-name</w:t>
+      </w:r>
+    </w:p>
+    <w:p>
+      <w:r>
+        <w:t xml:space="preserve"># </w:t>
+      </w:r>
+      <w:proofErr w:type="gramStart"/>
+      <w:r>
+        <w:t>to</w:t>
+      </w:r>
+      <w:proofErr w:type="gramEnd"/>
+      <w:r>
+        <w:t xml:space="preserve"> switch branch</w:t>
+      </w:r>
+    </w:p>
+    <w:p>
+      <w:proofErr w:type="spellStart"/>
+      <w:proofErr w:type="gramStart"/>
+      <w:r>
+        <w:t>git</w:t>
+      </w:r>
+      <w:proofErr w:type="spellEnd"/>
+      <w:proofErr w:type="gramEnd"/>
+      <w:r>
+        <w:t xml:space="preserve"> checkout branch-name</w:t>
+      </w:r>
+    </w:p>
+    <w:p>
+      <w:r>
+        <w:t xml:space="preserve"># </w:t>
+      </w:r>
+      <w:proofErr w:type="gramStart"/>
+      <w:r>
+        <w:t>merge</w:t>
+      </w:r>
+      <w:proofErr w:type="gramEnd"/>
+      <w:r>
+        <w:t xml:space="preserve"> to a branch</w:t>
+      </w:r>
+      <w:r>
+        <w:t xml:space="preserve"> – the target branch will be merged to the current branch</w:t>
+      </w:r>
+    </w:p>
+    <w:p>
+      <w:proofErr w:type="spellStart"/>
+      <w:proofErr w:type="gramStart"/>
+      <w:r>
+        <w:t>git</w:t>
+      </w:r>
+      <w:proofErr w:type="spellEnd"/>
+      <w:proofErr w:type="gramEnd"/>
+      <w:r>
+        <w:t xml:space="preserve"> merge branch-name</w:t>
+      </w:r>
+    </w:p>
+    <w:p>
+      <w:pPr>
+        <w:rPr>
+          <w:i/>
+        </w:rPr>
+      </w:pPr>
+      <w:proofErr w:type="gramStart"/>
+      <w:r>
+        <w:rPr>
+          <w:i/>
+        </w:rPr>
+        <w:t>however</w:t>
+      </w:r>
+      <w:proofErr w:type="gramEnd"/>
+      <w:r>
+        <w:rPr>
+          <w:i/>
+        </w:rPr>
+        <w:t xml:space="preserve"> the better practice is to not merge a branch directly to dev or main rather create a PR</w:t>
+      </w:r>
+    </w:p>
+    <w:p>
+      <w:pPr>
+        <w:rPr>
+          <w:i/>
+        </w:rPr>
+      </w:pPr>
+    </w:p>
     <w:sectPr>
       <w:pgSz w:w="12240" w:h="15840"/>
       <w:pgMar w:top="1440" w:right="1440" w:bottom="1440" w:left="1440" w:header="720" w:footer="720" w:gutter="0"/>

</xml_diff>

<commit_message>
addition of intro to stats lecture
</commit_message>
<xml_diff>
--- a/additional_material/1_git_and_github/simple commands.docx
+++ b/additional_material/1_git_and_github/simple commands.docx
@@ -8,19 +8,11 @@
           <w:highlight w:val="yellow"/>
         </w:rPr>
       </w:pPr>
-      <w:proofErr w:type="spellStart"/>
       <w:r>
         <w:rPr>
           <w:highlight w:val="yellow"/>
         </w:rPr>
-        <w:t>Github</w:t>
-      </w:r>
-      <w:proofErr w:type="spellEnd"/>
-      <w:r>
-        <w:rPr>
-          <w:highlight w:val="yellow"/>
-        </w:rPr>
-        <w:t xml:space="preserve"> – </w:t>
+        <w:t xml:space="preserve">Github – </w:t>
       </w:r>
       <w:proofErr w:type="gramStart"/>
       <w:r>
@@ -757,8 +749,6 @@
         </w:rPr>
         <w:t xml:space="preserve"> to cloud</w:t>
       </w:r>
-      <w:bookmarkStart w:id="0" w:name="_GoBack"/>
-      <w:bookmarkEnd w:id="0"/>
     </w:p>
     <w:p>
       <w:pPr>
@@ -901,17 +891,7 @@
           <w:szCs w:val="21"/>
           <w:highlight w:val="yellow"/>
         </w:rPr>
-        <w:t xml:space="preserve"> push</w:t>
-      </w:r>
-      <w:r>
-        <w:rPr>
-          <w:rFonts w:ascii="Consolas" w:eastAsia="Times New Roman" w:hAnsi="Consolas" w:cs="Courier New"/>
-          <w:color w:val="1F2328"/>
-          <w:sz w:val="21"/>
-          <w:szCs w:val="21"/>
-          <w:highlight w:val="yellow"/>
-        </w:rPr>
-        <w:t xml:space="preserve"> origin main</w:t>
+        <w:t xml:space="preserve"> push origin main</w:t>
       </w:r>
     </w:p>
     <w:p>
@@ -940,6 +920,23 @@
         <w:t xml:space="preserve"> a new repository and commit code there and then make changes and commit code (3 commits)</w:t>
       </w:r>
     </w:p>
+    <w:p/>
+    <w:p>
+      <w:r>
+        <w:t>.</w:t>
+      </w:r>
+      <w:proofErr w:type="spellStart"/>
+      <w:r>
+        <w:t>gitignore</w:t>
+      </w:r>
+      <w:proofErr w:type="spellEnd"/>
+      <w:r>
+        <w:t xml:space="preserve"> – use to ignore the files that we do not want to track</w:t>
+      </w:r>
+      <w:bookmarkStart w:id="0" w:name="_GoBack"/>
+      <w:bookmarkEnd w:id="0"/>
+    </w:p>
+    <w:p/>
     <w:p>
       <w:proofErr w:type="gramStart"/>
       <w:r>
@@ -1118,7 +1115,6 @@
         <w:rPr>
           <w:highlight w:val="cyan"/>
         </w:rPr>
-        <w:lastRenderedPageBreak/>
         <w:t>Main</w:t>
       </w:r>
     </w:p>

</xml_diff>